<commit_message>
Executa scanners por comandos e usa Semgrep auto
</commit_message>
<xml_diff>
--- a/entrega/Relatorio_Checkpoint_DevSecOps_Grupo4.docx
+++ b/entrega/Relatorio_Checkpoint_DevSecOps_Grupo4.docx
@@ -1782,7 +1782,7 @@
           <w:color w:val="000000"/>
           <w:sz w:val="22"/>
         </w:rPr>
-        <w:t>O Semgrep foi executado primeiro com a configuração geral da comunidade, sem regra própria. O scan percorreu 1.027 arquivos, aplicou 408 regras e reportou 69 achados. A análise encontrou SQL Injection nas rotas de login e busca. Para a demonstração red e green, uma regra local mais estreita foi mantida apenas para garantir tempo e resultado determinísticos: o código vulnerável produziu um HIGH, a consulta foi parametrizada com replacements do Sequelize e o mesmo teste passou sem achados.</w:t>
+        <w:t>O Semgrep foi executado com a configuração geral da comunidade, sem regra própria do grupo. O scan completo percorreu 1.027 arquivos, aplicou 408 regras e reportou 69 achados. A demonstração red e green manteve o mesmo --config auto e restringiu apenas o alvo a routes/search.ts: a regra comunitária de injeção via Sequelize produziu um ERROR normalizado como HIGH, a consulta foi parametrizada com replacements e a repetição do scan passou sem achados no arquivo corrigido.</w:t>
       </w:r>
     </w:p>
     <w:p>
@@ -5954,6 +5954,7 @@
       <w:pPr>
         <w:spacing w:line="240" w:lineRule="auto" w:before="100" w:after="160"/>
         <w:ind w:left="142" w:right="142" w:firstLine="0"/>
+        <w:jc w:val="left"/>
         <w:shd w:fill="F4F6F7"/>
         <w:pBdr>
           <w:top w:val="single" w:sz="4" w:space="4" w:color="D9D9D9"/>
@@ -5968,9 +5969,9 @@
           <w:color w:val="000000"/>
           <w:sz w:val="17"/>
         </w:rPr>
-        <w:t>docker run --rm -v "${ProjectDir}target/juice-shop:/src/target/juice-shop" `</w:t>
+        <w:t>docker run --rm -v "${ProjectDir}\target\juice-shop:/src/target/juice-shop" `</w:t>
         <w:br/>
-        <w:t xml:space="preserve">  -v "${ProjectDir}reports:/src/reports" semgrep/semgrep:1.172.0 `</w:t>
+        <w:t xml:space="preserve">  -v "${ProjectDir}\reports:/src/reports" semgrep/semgrep:1.172.0 `</w:t>
         <w:br/>
         <w:t xml:space="preserve">  semgrep scan --config auto --json `</w:t>
         <w:br/>
@@ -6009,7 +6010,7 @@
         <w:keepLines/>
       </w:pPr>
       <w:r>
-        <w:t>Regra local do gate</w:t>
+        <w:t>Mesmo conjunto geral no red e green</w:t>
       </w:r>
     </w:p>
     <w:p>
@@ -6022,7 +6023,7 @@
           <w:color w:val="000000"/>
           <w:sz w:val="22"/>
         </w:rPr>
-        <w:t>A regra em security/semgrep.yml não foi necessária para encontrar SQL Injection no scan geral. Ela foi mantida para o laboratório de 12 minutos, porque limita o escopo a uma construção conhecida e torna o red e green reproduzível. A metadata devsecops_severity normaliza o achado como HIGH e CWE-89. Em produção, regras locais devem ter testes positivos e negativos, responsável e revisão quando o framework mudar.</w:t>
+        <w:t>O laboratório não possui arquivo de regra Semgrep criado pelo grupo. Tanto o código vulnerável quanto a cópia corrigida são analisados com --config auto. A demonstração limita somente o caminho a um arquivo para isolar o efeito da correção; o quality gate converte a severidade ERROR do Semgrep em HIGH. Em produção, o scan completo continua necessário, acompanhado de triagem, baseline e revisão de cobertura.</w:t>
       </w:r>
     </w:p>
     <w:p>
@@ -6229,8 +6230,8 @@
       <w:tblGrid>
         <w:gridCol w:w="1814"/>
         <w:gridCol w:w="1247"/>
-        <w:gridCol w:w="1247"/>
-        <w:gridCol w:w="1701"/>
+        <w:gridCol w:w="1587"/>
+        <w:gridCol w:w="1361"/>
         <w:gridCol w:w="3061"/>
       </w:tblGrid>
       <w:tr>
@@ -6297,7 +6298,7 @@
         </w:tc>
         <w:tc>
           <w:tcPr>
-            <w:tcW w:type="dxa" w:w="1247"/>
+            <w:tcW w:type="dxa" w:w="1587"/>
             <w:shd w:fill="0B2545"/>
             <w:tcMar>
               <w:top w:w="120" w:type="dxa"/>
@@ -6320,13 +6321,13 @@
                 <w:color w:val="FFFFFF"/>
                 <w:sz w:val="18"/>
               </w:rPr>
-              <w:t>Regras</w:t>
-            </w:r>
-          </w:p>
-        </w:tc>
-        <w:tc>
-          <w:tcPr>
-            <w:tcW w:type="dxa" w:w="1701"/>
+              <w:t>Configuração</w:t>
+            </w:r>
+          </w:p>
+        </w:tc>
+        <w:tc>
+          <w:tcPr>
+            <w:tcW w:type="dxa" w:w="1361"/>
             <w:shd w:fill="0B2545"/>
             <w:tcMar>
               <w:top w:w="120" w:type="dxa"/>
@@ -6444,7 +6445,7 @@
         </w:tc>
         <w:tc>
           <w:tcPr>
-            <w:tcW w:type="dxa" w:w="1247"/>
+            <w:tcW w:type="dxa" w:w="1587"/>
             <w:shd w:fill="FFFFFF"/>
             <w:tcMar>
               <w:top w:w="120" w:type="dxa"/>
@@ -6467,13 +6468,13 @@
                 <w:color w:val="000000"/>
                 <w:sz w:val="18"/>
               </w:rPr>
-              <w:t>3</w:t>
-            </w:r>
-          </w:p>
-        </w:tc>
-        <w:tc>
-          <w:tcPr>
-            <w:tcW w:type="dxa" w:w="1701"/>
+              <w:t>auto</w:t>
+            </w:r>
+          </w:p>
+        </w:tc>
+        <w:tc>
+          <w:tcPr>
+            <w:tcW w:type="dxa" w:w="1361"/>
             <w:shd w:fill="FFFFFF"/>
             <w:tcMar>
               <w:top w:w="120" w:type="dxa"/>
@@ -6591,7 +6592,7 @@
         </w:tc>
         <w:tc>
           <w:tcPr>
-            <w:tcW w:type="dxa" w:w="1247"/>
+            <w:tcW w:type="dxa" w:w="1587"/>
             <w:shd w:fill="EAF5F8"/>
             <w:tcMar>
               <w:top w:w="120" w:type="dxa"/>
@@ -6614,13 +6615,13 @@
                 <w:color w:val="000000"/>
                 <w:sz w:val="18"/>
               </w:rPr>
-              <w:t>3</w:t>
-            </w:r>
-          </w:p>
-        </w:tc>
-        <w:tc>
-          <w:tcPr>
-            <w:tcW w:type="dxa" w:w="1701"/>
+              <w:t>auto</w:t>
+            </w:r>
+          </w:p>
+        </w:tc>
+        <w:tc>
+          <w:tcPr>
+            <w:tcW w:type="dxa" w:w="1361"/>
             <w:shd w:fill="EAF5F8"/>
             <w:tcMar>
               <w:top w:w="120" w:type="dxa"/>
@@ -6699,6 +6700,7 @@
       <w:pPr>
         <w:spacing w:line="240" w:lineRule="auto" w:before="100" w:after="160"/>
         <w:ind w:left="142" w:right="142" w:firstLine="0"/>
+        <w:jc w:val="left"/>
         <w:shd w:fill="F4F6F7"/>
         <w:pBdr>
           <w:top w:val="single" w:sz="4" w:space="4" w:color="D9D9D9"/>
@@ -6735,6 +6737,7 @@
       <w:pPr>
         <w:spacing w:line="240" w:lineRule="auto" w:before="100" w:after="160"/>
         <w:ind w:left="142" w:right="142" w:firstLine="0"/>
+        <w:jc w:val="left"/>
         <w:shd w:fill="F4F6F7"/>
         <w:pBdr>
           <w:top w:val="single" w:sz="4" w:space="4" w:color="D9D9D9"/>
@@ -6768,7 +6771,7 @@
           <w:color w:val="000000"/>
           <w:sz w:val="22"/>
         </w:rPr>
-        <w:t>A correção separa o valor fornecido pelo usuário da estrutura da consulta. O marcador :criteria é resolvido pelo driver com replacements, reduzindo a possibilidade de o conteúdo alterar a sintaxe SQL. A validação green prova que a regra local deixou de encontrar o padrão naquele arquivo; não prova que todo o Juice Shop está seguro.</w:t>
+        <w:t>A correção separa o valor fornecido pelo usuário da estrutura da consulta. O marcador :criteria é resolvido pelo driver com replacements, reduzindo a possibilidade de o conteúdo alterar a sintaxe SQL. A validação green prova que a regra comunitária deixou de encontrar o fluxo inseguro naquele arquivo; não prova que todo o Juice Shop está seguro.</w:t>
       </w:r>
     </w:p>
     <w:p>
@@ -6792,7 +6795,7 @@
           <w:color w:val="000000"/>
           <w:sz w:val="22"/>
         </w:rPr>
-        <w:t>As 69 ocorrências não foram integralmente classificadas, portanto não existe uma taxa geral confiável. No recorte da regra comunitária de injeção via Sequelize, seis matches foram encontrados: dois em rotas executáveis e quatro em data/static/codefixes, arquivos didáticos. Para o risco de produção, esses quatro são ruído operacional, o que corresponde a 66,7% no recorte. A regra local do laboratório produziu um match verdadeiro e nenhum falso positivo. O scan geral levou cerca de três minutos; o recorte de um arquivo terminou em menos de um segundo.</w:t>
+        <w:t>As 69 ocorrências não foram integralmente classificadas, portanto não existe uma taxa geral confiável. No recorte da regra comunitária de injeção via Sequelize, seis matches foram encontrados: dois em rotas executáveis e quatro em data/static/codefixes, arquivos didáticos. Para o risco de produção, esses quatro são ruído operacional, o que corresponde a 66,7% no recorte. Ao analisar apenas a rota escolhida para o red/green, o resultado vulnerável foi um verdadeiro positivo e a versão parametrizada não gerou match. Os dois cenários executaram 210 regras comunitárias; o tempo interno foi 4,242 s no red e 3,542 s no green.</w:t>
       </w:r>
     </w:p>
     <w:p>
@@ -7431,6 +7434,7 @@
       <w:pPr>
         <w:spacing w:line="240" w:lineRule="auto" w:before="100" w:after="160"/>
         <w:ind w:left="142" w:right="142" w:firstLine="0"/>
+        <w:jc w:val="left"/>
         <w:shd w:fill="F4F6F7"/>
         <w:pBdr>
           <w:top w:val="single" w:sz="4" w:space="4" w:color="D9D9D9"/>
@@ -8893,6 +8897,7 @@
       <w:pPr>
         <w:spacing w:line="240" w:lineRule="auto" w:before="100" w:after="160"/>
         <w:ind w:left="142" w:right="142" w:firstLine="0"/>
+        <w:jc w:val="left"/>
         <w:shd w:fill="F4F6F7"/>
         <w:pBdr>
           <w:top w:val="single" w:sz="4" w:space="4" w:color="D9D9D9"/>
@@ -8909,7 +8914,7 @@
         </w:rPr>
         <w:t>docker run --rm `</w:t>
         <w:br/>
-        <w:t xml:space="preserve">  -v "${ProjectDir}target/juice-shop/terraform:/tf:ro" `</w:t>
+        <w:t xml:space="preserve">  -v "${ProjectDir}\target\juice-shop\terraform:/tf:ro" `</w:t>
         <w:br/>
         <w:t xml:space="preserve">  ghcr.io/bridgecrewio/checkov:3.3.11 -d /tf `</w:t>
         <w:br/>
@@ -10672,6 +10677,7 @@
       <w:pPr>
         <w:spacing w:line="240" w:lineRule="auto" w:before="100" w:after="160"/>
         <w:ind w:left="142" w:right="142" w:firstLine="0"/>
+        <w:jc w:val="left"/>
         <w:shd w:fill="F4F6F7"/>
         <w:pBdr>
           <w:top w:val="single" w:sz="4" w:space="4" w:color="D9D9D9"/>
@@ -17035,6 +17041,7 @@
       <w:pPr>
         <w:spacing w:line="240" w:lineRule="auto" w:before="100" w:after="160"/>
         <w:ind w:left="142" w:right="142" w:firstLine="0"/>
+        <w:jc w:val="left"/>
         <w:shd w:fill="F4F6F7"/>
         <w:pBdr>
           <w:top w:val="single" w:sz="4" w:space="4" w:color="D9D9D9"/>
@@ -17053,7 +17060,11 @@
         <w:br/>
         <w:t>Set-Location "C:\Users\Hayom\Documents\CheckpointDevOps"</w:t>
         <w:br/>
-        <w:t>docker version</w:t>
+        <w:t>$ProjectDir = (Get-Location).Path</w:t>
+        <w:br/>
+        <w:t>.\scripts\fetch-target.ps1</w:t>
+        <w:br/>
+        <w:t>New-Item -ItemType Directory -Force .\reports | Out-Null</w:t>
       </w:r>
     </w:p>
     <w:p>
@@ -17064,13 +17075,14 @@
         <w:keepLines/>
       </w:pPr>
       <w:r>
-        <w:t>Laboratório red green e DAST</w:t>
+        <w:t>Semgrep red e green por comandos</w:t>
       </w:r>
     </w:p>
     <w:p>
       <w:pPr>
         <w:spacing w:line="240" w:lineRule="auto" w:before="100" w:after="160"/>
         <w:ind w:left="142" w:right="142" w:firstLine="0"/>
+        <w:jc w:val="left"/>
         <w:shd w:fill="F4F6F7"/>
         <w:pBdr>
           <w:top w:val="single" w:sz="4" w:space="4" w:color="D9D9D9"/>
@@ -17085,11 +17097,34 @@
           <w:color w:val="000000"/>
           <w:sz w:val="17"/>
         </w:rPr>
-        <w:t>.\scripts\run-lab.ps1 -Mode sast-red</w:t>
+        <w:t># RED: regras comunitárias gerais</w:t>
         <w:br/>
-        <w:t>.\scripts\run-lab.ps1 -Mode sast-green</w:t>
+        <w:t>docker compose --profile tools run --rm semgrep semgrep scan `</w:t>
         <w:br/>
-        <w:t>.\scripts\run-lab.ps1 -Mode dast</w:t>
+        <w:t xml:space="preserve">  --config auto --json --output /workspace/reports/semgrep-red.json `</w:t>
+        <w:br/>
+        <w:t xml:space="preserve">  /workspace/target/juice-shop/routes/search.ts</w:t>
+        <w:br/>
+        <w:br/>
+        <w:t>docker compose --profile tools run --rm gate node /workspace/scripts/quality-gate.mjs `</w:t>
+        <w:br/>
+        <w:t xml:space="preserve">  --semgrep /workspace/reports/semgrep-red.json --threshold HIGH --expect fail</w:t>
+        <w:br/>
+        <w:br/>
+        <w:t># CORREÇÃO E GREEN</w:t>
+        <w:br/>
+        <w:t>.\scripts\prepare-green.ps1</w:t>
+        <w:br/>
+        <w:t>docker compose --profile tools run --rm semgrep semgrep scan `</w:t>
+        <w:br/>
+        <w:t xml:space="preserve">  --config auto --json --output /workspace/reports/semgrep-green.json `</w:t>
+        <w:br/>
+        <w:t xml:space="preserve">  /workspace/target/juice-shop-fixed/routes/search.ts</w:t>
+        <w:br/>
+        <w:br/>
+        <w:t>docker compose --profile tools run --rm gate node /workspace/scripts/quality-gate.mjs `</w:t>
+        <w:br/>
+        <w:t xml:space="preserve">  --semgrep /workspace/reports/semgrep-green.json --threshold HIGH --expect pass</w:t>
       </w:r>
     </w:p>
     <w:p>
@@ -17100,13 +17135,14 @@
         <w:keepLines/>
       </w:pPr>
       <w:r>
-        <w:t>Execuções complementares</w:t>
+        <w:t>OWASP ZAP por comando</w:t>
       </w:r>
     </w:p>
     <w:p>
       <w:pPr>
         <w:spacing w:line="240" w:lineRule="auto" w:before="100" w:after="160"/>
         <w:ind w:left="142" w:right="142" w:firstLine="0"/>
+        <w:jc w:val="left"/>
         <w:shd w:fill="F4F6F7"/>
         <w:pBdr>
           <w:top w:val="single" w:sz="4" w:space="4" w:color="D9D9D9"/>
@@ -17121,18 +17157,48 @@
           <w:color w:val="000000"/>
           <w:sz w:val="17"/>
         </w:rPr>
-        <w:t># Semgrep geral</w:t>
+        <w:t>docker compose up -d juice-shop</w:t>
         <w:br/>
-        <w:t>docker run --rm -v "${ProjectDir}target/juice-shop:/src/target/juice-shop" `</w:t>
+        <w:t>docker compose --profile tools run --rm zap</w:t>
         <w:br/>
-        <w:t xml:space="preserve">  semgrep/semgrep:1.172.0 semgrep scan --config auto /src/target/juice-shop</w:t>
+        <w:t>docker compose --profile tools run --rm gate node /workspace/scripts/quality-gate.mjs `</w:t>
         <w:br/>
+        <w:t xml:space="preserve">  --zap /workspace/reports/zap-juice-shop.json --threshold HIGH --expect fail</w:t>
+      </w:r>
+    </w:p>
+    <w:p>
+      <w:pPr>
+        <w:pStyle w:val="Heading2"/>
+        <w:ind w:firstLine="0"/>
+        <w:keepNext/>
+        <w:keepLines/>
+      </w:pPr>
+      <w:r>
+        <w:t>Execução complementar do Checkov</w:t>
+      </w:r>
+    </w:p>
+    <w:p>
+      <w:pPr>
+        <w:spacing w:line="240" w:lineRule="auto" w:before="100" w:after="160"/>
+        <w:ind w:left="142" w:right="142" w:firstLine="0"/>
+        <w:jc w:val="left"/>
+        <w:shd w:fill="F4F6F7"/>
+        <w:pBdr>
+          <w:top w:val="single" w:sz="4" w:space="4" w:color="D9D9D9"/>
+          <w:left w:val="single" w:sz="4" w:space="4" w:color="D9D9D9"/>
+          <w:bottom w:val="single" w:sz="4" w:space="4" w:color="D9D9D9"/>
+          <w:right w:val="single" w:sz="4" w:space="4" w:color="D9D9D9"/>
+        </w:pBdr>
+      </w:pPr>
+      <w:r>
+        <w:rPr>
+          <w:rFonts w:ascii="Consolas" w:hAnsi="Consolas" w:eastAsia="Consolas"/>
+          <w:color w:val="000000"/>
+          <w:sz w:val="17"/>
+        </w:rPr>
+        <w:t>docker run --rm -v "${ProjectDir}\target\juice-shop\terraform:/tf:ro" `</w:t>
         <w:br/>
-        <w:t># Checkov</w:t>
-        <w:br/>
-        <w:t>docker run --rm -v "${ProjectDir}target/juice-shop/terraform:/tf:ro" `</w:t>
-        <w:br/>
-        <w:t xml:space="preserve">  ghcr.io/bridgecrewio/checkov:3.3.11 -d /tf --framework terraform --compact</w:t>
+        <w:t xml:space="preserve">  ghcr.io/bridgecrewio/checkov:3.3.11 -d /tf --framework terraform --compact --soft-fail</w:t>
       </w:r>
     </w:p>
     <w:p>
@@ -17150,6 +17216,7 @@
       <w:pPr>
         <w:spacing w:line="240" w:lineRule="auto" w:before="100" w:after="160"/>
         <w:ind w:left="142" w:right="142" w:firstLine="0"/>
+        <w:jc w:val="left"/>
         <w:shd w:fill="F4F6F7"/>
         <w:pBdr>
           <w:top w:val="single" w:sz="4" w:space="4" w:color="D9D9D9"/>

</xml_diff>